<commit_message>
knowleddge 7/3/2026 part 8
</commit_message>
<xml_diff>
--- a/Knowledge/3-Work knowledge/1-Software Engineering/2-General Technologies/9-Databases/5-My Source/2-SQL/3-SQL Commands - DML/1-Intro to SQL Commands - DML.docx
+++ b/Knowledge/3-Work knowledge/1-Software Engineering/2-General Technologies/9-Databases/5-My Source/2-SQL/3-SQL Commands - DML/1-Intro to SQL Commands - DML.docx
@@ -31,9 +31,13 @@
     <w:p>
       <w:pPr>
         <w:spacing w:before="240" w:after="240"/>
-      </w:pPr>
-      <w:r>
-        <w:rPr>
+        <w:rPr>
+          <w:rFonts w:ascii="Arial" w:hAnsi="Arial" w:cs="Arial"/>
+        </w:rPr>
+      </w:pPr>
+      <w:r>
+        <w:rPr>
+          <w:rFonts w:ascii="Arial" w:hAnsi="Arial" w:cs="Arial"/>
           <w:b/>
           <w:color w:val="000000"/>
           <w:sz w:val="18"/>
@@ -43,14 +47,36 @@
       </w:r>
       <w:r>
         <w:rPr>
-          <w:color w:val="000000"/>
-          <w:sz w:val="18"/>
-          <w:highlight w:val="lightGray"/>
-        </w:rPr>
-        <w:t xml:space="preserve">: Persons Table -&gt; ID Column: 1, Name_En Column: Motasem Essam] -&gt; </w:t>
-      </w:r>
-      <w:r>
-        <w:rPr>
+          <w:rFonts w:ascii="Arial" w:hAnsi="Arial" w:cs="Arial"/>
+          <w:color w:val="000000"/>
+          <w:sz w:val="18"/>
+          <w:highlight w:val="lightGray"/>
+        </w:rPr>
+        <w:t xml:space="preserve">: Persons Table -&gt; ID Column: 1, </w:t>
+      </w:r>
+      <w:proofErr w:type="spellStart"/>
+      <w:r>
+        <w:rPr>
+          <w:rFonts w:ascii="Arial" w:hAnsi="Arial" w:cs="Arial"/>
+          <w:color w:val="000000"/>
+          <w:sz w:val="18"/>
+          <w:highlight w:val="lightGray"/>
+        </w:rPr>
+        <w:t>Name_En</w:t>
+      </w:r>
+      <w:proofErr w:type="spellEnd"/>
+      <w:r>
+        <w:rPr>
+          <w:rFonts w:ascii="Arial" w:hAnsi="Arial" w:cs="Arial"/>
+          <w:color w:val="000000"/>
+          <w:sz w:val="18"/>
+          <w:highlight w:val="lightGray"/>
+        </w:rPr>
+        <w:t xml:space="preserve"> Column: Motasem Essam] -&gt; </w:t>
+      </w:r>
+      <w:r>
+        <w:rPr>
+          <w:rFonts w:ascii="Arial" w:hAnsi="Arial" w:cs="Arial"/>
           <w:b/>
           <w:color w:val="000000"/>
           <w:sz w:val="18"/>
@@ -60,6 +86,7 @@
       </w:r>
       <w:r>
         <w:rPr>
+          <w:rFonts w:ascii="Arial" w:hAnsi="Arial" w:cs="Arial"/>
           <w:color w:val="000000"/>
           <w:sz w:val="18"/>
           <w:highlight w:val="lightGray"/>
@@ -68,6 +95,7 @@
       </w:r>
       <w:r>
         <w:rPr>
+          <w:rFonts w:ascii="Arial" w:hAnsi="Arial" w:cs="Arial"/>
           <w:b/>
           <w:color w:val="000000"/>
           <w:sz w:val="18"/>
@@ -77,6 +105,7 @@
       </w:r>
       <w:r>
         <w:rPr>
+          <w:rFonts w:ascii="Arial" w:hAnsi="Arial" w:cs="Arial"/>
           <w:color w:val="000000"/>
           <w:sz w:val="18"/>
           <w:highlight w:val="lightGray"/>
@@ -188,6 +217,7 @@
       </w:pPr>
       <w:r>
         <w:rPr>
+          <w:rFonts w:ascii="Arial" w:hAnsi="Arial" w:cs="Arial"/>
           <w:b/>
           <w:color w:val="000000"/>
           <w:sz w:val="18"/>
@@ -197,14 +227,36 @@
       </w:r>
       <w:r>
         <w:rPr>
-          <w:color w:val="000000"/>
-          <w:sz w:val="18"/>
-          <w:highlight w:val="lightGray"/>
-        </w:rPr>
-        <w:t xml:space="preserve">: Persons Table -&gt; ID Column: 1, Name_En Column: Motasem Essam] -&gt; </w:t>
-      </w:r>
-      <w:r>
-        <w:rPr>
+          <w:rFonts w:ascii="Arial" w:hAnsi="Arial" w:cs="Arial"/>
+          <w:color w:val="000000"/>
+          <w:sz w:val="18"/>
+          <w:highlight w:val="lightGray"/>
+        </w:rPr>
+        <w:t xml:space="preserve">: Persons Table -&gt; ID Column: 1, </w:t>
+      </w:r>
+      <w:proofErr w:type="spellStart"/>
+      <w:r>
+        <w:rPr>
+          <w:rFonts w:ascii="Arial" w:hAnsi="Arial" w:cs="Arial"/>
+          <w:color w:val="000000"/>
+          <w:sz w:val="18"/>
+          <w:highlight w:val="lightGray"/>
+        </w:rPr>
+        <w:t>Name_En</w:t>
+      </w:r>
+      <w:proofErr w:type="spellEnd"/>
+      <w:r>
+        <w:rPr>
+          <w:rFonts w:ascii="Arial" w:hAnsi="Arial" w:cs="Arial"/>
+          <w:color w:val="000000"/>
+          <w:sz w:val="18"/>
+          <w:highlight w:val="lightGray"/>
+        </w:rPr>
+        <w:t xml:space="preserve"> Column: Motasem Essam] -&gt; </w:t>
+      </w:r>
+      <w:r>
+        <w:rPr>
+          <w:rFonts w:ascii="Arial" w:hAnsi="Arial" w:cs="Arial"/>
           <w:b/>
           <w:color w:val="000000"/>
           <w:sz w:val="18"/>
@@ -214,6 +266,7 @@
       </w:r>
       <w:r>
         <w:rPr>
+          <w:rFonts w:ascii="Arial" w:hAnsi="Arial" w:cs="Arial"/>
           <w:color w:val="000000"/>
           <w:sz w:val="18"/>
           <w:highlight w:val="lightGray"/>
@@ -222,6 +275,7 @@
       </w:r>
       <w:r>
         <w:rPr>
+          <w:rFonts w:ascii="Arial" w:hAnsi="Arial" w:cs="Arial"/>
           <w:b/>
           <w:color w:val="000000"/>
           <w:sz w:val="18"/>
@@ -231,6 +285,7 @@
       </w:r>
       <w:r>
         <w:rPr>
+          <w:rFonts w:ascii="Arial" w:hAnsi="Arial" w:cs="Arial"/>
           <w:color w:val="000000"/>
           <w:sz w:val="18"/>
           <w:highlight w:val="lightGray"/>
@@ -557,6 +612,7 @@
                 <w:rFonts w:ascii="Roboto Mono" w:eastAsia="Roboto Mono" w:hAnsi="Roboto Mono" w:cs="Roboto Mono"/>
                 <w:color w:val="188038"/>
               </w:rPr>
+              <w:lastRenderedPageBreak/>
               <w:t>MERGE</w:t>
             </w:r>
           </w:p>
@@ -644,6 +700,7 @@
       </w:pPr>
       <w:r>
         <w:rPr>
+          <w:rFonts w:ascii="Arial" w:hAnsi="Arial" w:cs="Arial"/>
           <w:b/>
           <w:color w:val="000000"/>
           <w:sz w:val="18"/>
@@ -653,14 +710,36 @@
       </w:r>
       <w:r>
         <w:rPr>
-          <w:color w:val="000000"/>
-          <w:sz w:val="18"/>
-          <w:highlight w:val="lightGray"/>
-        </w:rPr>
-        <w:t xml:space="preserve">: Persons Table -&gt; ID Column: 1, Name_En Column: Motasem Essam] -&gt; </w:t>
-      </w:r>
-      <w:r>
-        <w:rPr>
+          <w:rFonts w:ascii="Arial" w:hAnsi="Arial" w:cs="Arial"/>
+          <w:color w:val="000000"/>
+          <w:sz w:val="18"/>
+          <w:highlight w:val="lightGray"/>
+        </w:rPr>
+        <w:t xml:space="preserve">: Persons Table -&gt; ID Column: 1, </w:t>
+      </w:r>
+      <w:proofErr w:type="spellStart"/>
+      <w:r>
+        <w:rPr>
+          <w:rFonts w:ascii="Arial" w:hAnsi="Arial" w:cs="Arial"/>
+          <w:color w:val="000000"/>
+          <w:sz w:val="18"/>
+          <w:highlight w:val="lightGray"/>
+        </w:rPr>
+        <w:t>Name_En</w:t>
+      </w:r>
+      <w:proofErr w:type="spellEnd"/>
+      <w:r>
+        <w:rPr>
+          <w:rFonts w:ascii="Arial" w:hAnsi="Arial" w:cs="Arial"/>
+          <w:color w:val="000000"/>
+          <w:sz w:val="18"/>
+          <w:highlight w:val="lightGray"/>
+        </w:rPr>
+        <w:t xml:space="preserve"> Column: Motasem Essam] -&gt; </w:t>
+      </w:r>
+      <w:r>
+        <w:rPr>
+          <w:rFonts w:ascii="Arial" w:hAnsi="Arial" w:cs="Arial"/>
           <w:b/>
           <w:color w:val="000000"/>
           <w:sz w:val="18"/>
@@ -670,6 +749,7 @@
       </w:r>
       <w:r>
         <w:rPr>
+          <w:rFonts w:ascii="Arial" w:hAnsi="Arial" w:cs="Arial"/>
           <w:color w:val="000000"/>
           <w:sz w:val="18"/>
           <w:highlight w:val="lightGray"/>
@@ -678,6 +758,7 @@
       </w:r>
       <w:r>
         <w:rPr>
+          <w:rFonts w:ascii="Arial" w:hAnsi="Arial" w:cs="Arial"/>
           <w:b/>
           <w:color w:val="000000"/>
           <w:sz w:val="18"/>
@@ -687,6 +768,7 @@
       </w:r>
       <w:r>
         <w:rPr>
+          <w:rFonts w:ascii="Arial" w:hAnsi="Arial" w:cs="Arial"/>
           <w:color w:val="000000"/>
           <w:sz w:val="18"/>
           <w:highlight w:val="lightGray"/>
@@ -786,6 +868,7 @@
       </w:pPr>
       <w:r>
         <w:rPr>
+          <w:rFonts w:ascii="Arial" w:hAnsi="Arial" w:cs="Arial"/>
           <w:b/>
           <w:color w:val="000000"/>
           <w:sz w:val="18"/>
@@ -795,14 +878,36 @@
       </w:r>
       <w:r>
         <w:rPr>
-          <w:color w:val="000000"/>
-          <w:sz w:val="18"/>
-          <w:highlight w:val="lightGray"/>
-        </w:rPr>
-        <w:t xml:space="preserve">: Persons Table -&gt; ID Column: 1, Name_En Column: Motasem Essam] -&gt; </w:t>
-      </w:r>
-      <w:r>
-        <w:rPr>
+          <w:rFonts w:ascii="Arial" w:hAnsi="Arial" w:cs="Arial"/>
+          <w:color w:val="000000"/>
+          <w:sz w:val="18"/>
+          <w:highlight w:val="lightGray"/>
+        </w:rPr>
+        <w:t xml:space="preserve">: Persons Table -&gt; ID Column: 1, </w:t>
+      </w:r>
+      <w:proofErr w:type="spellStart"/>
+      <w:r>
+        <w:rPr>
+          <w:rFonts w:ascii="Arial" w:hAnsi="Arial" w:cs="Arial"/>
+          <w:color w:val="000000"/>
+          <w:sz w:val="18"/>
+          <w:highlight w:val="lightGray"/>
+        </w:rPr>
+        <w:t>Name_En</w:t>
+      </w:r>
+      <w:proofErr w:type="spellEnd"/>
+      <w:r>
+        <w:rPr>
+          <w:rFonts w:ascii="Arial" w:hAnsi="Arial" w:cs="Arial"/>
+          <w:color w:val="000000"/>
+          <w:sz w:val="18"/>
+          <w:highlight w:val="lightGray"/>
+        </w:rPr>
+        <w:t xml:space="preserve"> Column: Motasem Essam] -&gt; </w:t>
+      </w:r>
+      <w:r>
+        <w:rPr>
+          <w:rFonts w:ascii="Arial" w:hAnsi="Arial" w:cs="Arial"/>
           <w:b/>
           <w:color w:val="000000"/>
           <w:sz w:val="18"/>
@@ -812,6 +917,7 @@
       </w:r>
       <w:r>
         <w:rPr>
+          <w:rFonts w:ascii="Arial" w:hAnsi="Arial" w:cs="Arial"/>
           <w:color w:val="000000"/>
           <w:sz w:val="18"/>
           <w:highlight w:val="lightGray"/>
@@ -820,6 +926,7 @@
       </w:r>
       <w:r>
         <w:rPr>
+          <w:rFonts w:ascii="Arial" w:hAnsi="Arial" w:cs="Arial"/>
           <w:b/>
           <w:color w:val="000000"/>
           <w:sz w:val="18"/>
@@ -829,6 +936,7 @@
       </w:r>
       <w:r>
         <w:rPr>
+          <w:rFonts w:ascii="Arial" w:hAnsi="Arial" w:cs="Arial"/>
           <w:color w:val="000000"/>
           <w:sz w:val="18"/>
           <w:highlight w:val="lightGray"/>
@@ -920,6 +1028,7 @@
         <w:rPr>
           <w:color w:val="000000"/>
         </w:rPr>
+        <w:lastRenderedPageBreak/>
         <w:t xml:space="preserve">🔹 </w:t>
       </w:r>
       <w:r>
@@ -936,6 +1045,7 @@
       </w:pPr>
       <w:r>
         <w:rPr>
+          <w:rFonts w:ascii="Arial" w:hAnsi="Arial" w:cs="Arial"/>
           <w:b/>
           <w:color w:val="000000"/>
           <w:sz w:val="18"/>
@@ -945,14 +1055,36 @@
       </w:r>
       <w:r>
         <w:rPr>
-          <w:color w:val="000000"/>
-          <w:sz w:val="18"/>
-          <w:highlight w:val="lightGray"/>
-        </w:rPr>
-        <w:t xml:space="preserve">: Persons Table -&gt; ID Column: 1, Name_En Column: Motasem Essam] -&gt; </w:t>
-      </w:r>
-      <w:r>
-        <w:rPr>
+          <w:rFonts w:ascii="Arial" w:hAnsi="Arial" w:cs="Arial"/>
+          <w:color w:val="000000"/>
+          <w:sz w:val="18"/>
+          <w:highlight w:val="lightGray"/>
+        </w:rPr>
+        <w:t xml:space="preserve">: Persons Table -&gt; ID Column: 1, </w:t>
+      </w:r>
+      <w:proofErr w:type="spellStart"/>
+      <w:r>
+        <w:rPr>
+          <w:rFonts w:ascii="Arial" w:hAnsi="Arial" w:cs="Arial"/>
+          <w:color w:val="000000"/>
+          <w:sz w:val="18"/>
+          <w:highlight w:val="lightGray"/>
+        </w:rPr>
+        <w:t>Name_En</w:t>
+      </w:r>
+      <w:proofErr w:type="spellEnd"/>
+      <w:r>
+        <w:rPr>
+          <w:rFonts w:ascii="Arial" w:hAnsi="Arial" w:cs="Arial"/>
+          <w:color w:val="000000"/>
+          <w:sz w:val="18"/>
+          <w:highlight w:val="lightGray"/>
+        </w:rPr>
+        <w:t xml:space="preserve"> Column: Motasem Essam] -&gt; </w:t>
+      </w:r>
+      <w:r>
+        <w:rPr>
+          <w:rFonts w:ascii="Arial" w:hAnsi="Arial" w:cs="Arial"/>
           <w:b/>
           <w:color w:val="000000"/>
           <w:sz w:val="18"/>
@@ -962,6 +1094,7 @@
       </w:r>
       <w:r>
         <w:rPr>
+          <w:rFonts w:ascii="Arial" w:hAnsi="Arial" w:cs="Arial"/>
           <w:color w:val="000000"/>
           <w:sz w:val="18"/>
           <w:highlight w:val="lightGray"/>
@@ -970,6 +1103,7 @@
       </w:r>
       <w:r>
         <w:rPr>
+          <w:rFonts w:ascii="Arial" w:hAnsi="Arial" w:cs="Arial"/>
           <w:b/>
           <w:color w:val="000000"/>
           <w:sz w:val="18"/>
@@ -979,6 +1113,7 @@
       </w:r>
       <w:r>
         <w:rPr>
+          <w:rFonts w:ascii="Arial" w:hAnsi="Arial" w:cs="Arial"/>
           <w:color w:val="000000"/>
           <w:sz w:val="18"/>
           <w:highlight w:val="lightGray"/>
@@ -1074,6 +1209,7 @@
       </w:pPr>
       <w:r>
         <w:rPr>
+          <w:rFonts w:ascii="Arial" w:hAnsi="Arial" w:cs="Arial"/>
           <w:b/>
           <w:color w:val="000000"/>
           <w:sz w:val="18"/>
@@ -1083,14 +1219,36 @@
       </w:r>
       <w:r>
         <w:rPr>
-          <w:color w:val="000000"/>
-          <w:sz w:val="18"/>
-          <w:highlight w:val="lightGray"/>
-        </w:rPr>
-        <w:t xml:space="preserve">: Persons Table -&gt; ID Column: 1, Name_En Column: Motasem Essam] -&gt; </w:t>
-      </w:r>
-      <w:r>
-        <w:rPr>
+          <w:rFonts w:ascii="Arial" w:hAnsi="Arial" w:cs="Arial"/>
+          <w:color w:val="000000"/>
+          <w:sz w:val="18"/>
+          <w:highlight w:val="lightGray"/>
+        </w:rPr>
+        <w:t xml:space="preserve">: Persons Table -&gt; ID Column: 1, </w:t>
+      </w:r>
+      <w:proofErr w:type="spellStart"/>
+      <w:r>
+        <w:rPr>
+          <w:rFonts w:ascii="Arial" w:hAnsi="Arial" w:cs="Arial"/>
+          <w:color w:val="000000"/>
+          <w:sz w:val="18"/>
+          <w:highlight w:val="lightGray"/>
+        </w:rPr>
+        <w:t>Name_En</w:t>
+      </w:r>
+      <w:proofErr w:type="spellEnd"/>
+      <w:r>
+        <w:rPr>
+          <w:rFonts w:ascii="Arial" w:hAnsi="Arial" w:cs="Arial"/>
+          <w:color w:val="000000"/>
+          <w:sz w:val="18"/>
+          <w:highlight w:val="lightGray"/>
+        </w:rPr>
+        <w:t xml:space="preserve"> Column: Motasem Essam] -&gt; </w:t>
+      </w:r>
+      <w:r>
+        <w:rPr>
+          <w:rFonts w:ascii="Arial" w:hAnsi="Arial" w:cs="Arial"/>
           <w:b/>
           <w:color w:val="000000"/>
           <w:sz w:val="18"/>
@@ -1100,6 +1258,7 @@
       </w:r>
       <w:r>
         <w:rPr>
+          <w:rFonts w:ascii="Arial" w:hAnsi="Arial" w:cs="Arial"/>
           <w:color w:val="000000"/>
           <w:sz w:val="18"/>
           <w:highlight w:val="lightGray"/>
@@ -1108,6 +1267,7 @@
       </w:r>
       <w:r>
         <w:rPr>
+          <w:rFonts w:ascii="Arial" w:hAnsi="Arial" w:cs="Arial"/>
           <w:b/>
           <w:color w:val="000000"/>
           <w:sz w:val="18"/>
@@ -1117,6 +1277,7 @@
       </w:r>
       <w:r>
         <w:rPr>
+          <w:rFonts w:ascii="Arial" w:hAnsi="Arial" w:cs="Arial"/>
           <w:color w:val="000000"/>
           <w:sz w:val="18"/>
           <w:highlight w:val="lightGray"/>
@@ -1317,6 +1478,7 @@
       </w:pPr>
       <w:r>
         <w:rPr>
+          <w:rFonts w:ascii="Arial" w:hAnsi="Arial" w:cs="Arial"/>
           <w:b/>
           <w:color w:val="000000"/>
           <w:sz w:val="18"/>
@@ -1326,14 +1488,36 @@
       </w:r>
       <w:r>
         <w:rPr>
-          <w:color w:val="000000"/>
-          <w:sz w:val="18"/>
-          <w:highlight w:val="lightGray"/>
-        </w:rPr>
-        <w:t xml:space="preserve">: Persons Table -&gt; ID Column: 1, Name_En Column: Motasem Essam] -&gt; </w:t>
-      </w:r>
-      <w:r>
-        <w:rPr>
+          <w:rFonts w:ascii="Arial" w:hAnsi="Arial" w:cs="Arial"/>
+          <w:color w:val="000000"/>
+          <w:sz w:val="18"/>
+          <w:highlight w:val="lightGray"/>
+        </w:rPr>
+        <w:t xml:space="preserve">: Persons Table -&gt; ID Column: 1, </w:t>
+      </w:r>
+      <w:proofErr w:type="spellStart"/>
+      <w:r>
+        <w:rPr>
+          <w:rFonts w:ascii="Arial" w:hAnsi="Arial" w:cs="Arial"/>
+          <w:color w:val="000000"/>
+          <w:sz w:val="18"/>
+          <w:highlight w:val="lightGray"/>
+        </w:rPr>
+        <w:t>Name_En</w:t>
+      </w:r>
+      <w:proofErr w:type="spellEnd"/>
+      <w:r>
+        <w:rPr>
+          <w:rFonts w:ascii="Arial" w:hAnsi="Arial" w:cs="Arial"/>
+          <w:color w:val="000000"/>
+          <w:sz w:val="18"/>
+          <w:highlight w:val="lightGray"/>
+        </w:rPr>
+        <w:t xml:space="preserve"> Column: Motasem Essam] -&gt; </w:t>
+      </w:r>
+      <w:r>
+        <w:rPr>
+          <w:rFonts w:ascii="Arial" w:hAnsi="Arial" w:cs="Arial"/>
           <w:b/>
           <w:color w:val="000000"/>
           <w:sz w:val="18"/>
@@ -1343,6 +1527,7 @@
       </w:r>
       <w:r>
         <w:rPr>
+          <w:rFonts w:ascii="Arial" w:hAnsi="Arial" w:cs="Arial"/>
           <w:color w:val="000000"/>
           <w:sz w:val="18"/>
           <w:highlight w:val="lightGray"/>
@@ -1351,6 +1536,7 @@
       </w:r>
       <w:r>
         <w:rPr>
+          <w:rFonts w:ascii="Arial" w:hAnsi="Arial" w:cs="Arial"/>
           <w:b/>
           <w:color w:val="000000"/>
           <w:sz w:val="18"/>
@@ -1360,6 +1546,7 @@
       </w:r>
       <w:r>
         <w:rPr>
+          <w:rFonts w:ascii="Arial" w:hAnsi="Arial" w:cs="Arial"/>
           <w:color w:val="000000"/>
           <w:sz w:val="18"/>
           <w:highlight w:val="lightGray"/>
@@ -1453,6 +1640,7 @@
         <w:rPr>
           <w:rFonts w:ascii="Roboto Mono" w:eastAsia="Roboto Mono" w:hAnsi="Roboto Mono"/>
         </w:rPr>
+        <w:lastRenderedPageBreak/>
         <w:t>Let me know if you want a DML practice sheet or visual examples!</w:t>
       </w:r>
     </w:p>

</xml_diff>